<commit_message>
fix(report): finalize academic document structure
</commit_message>
<xml_diff>
--- a/MarkDown/FinalReport/LAPORAN_TUGAS_AKHIR_JUSTIFIQA.docx
+++ b/MarkDown/FinalReport/LAPORAN_TUGAS_AKHIR_JUSTIFIQA.docx
@@ -4,16 +4,9 @@
   <w:body>
     <w:p>
       <w:pPr>
-        <w:keepNext/>
-        <w:spacing w:before="240" w:after="120" w:line="276" w:lineRule="auto"/>
-      </w:pPr>
-      <w:r>
-        <w:rPr>
-          <w:rFonts w:ascii="Times New Roman" w:hAnsi="Times New Roman"/>
-          <w:b/>
-          <w:color w:val="003366"/>
-          <w:sz w:val="32"/>
-        </w:rPr>
+        <w:pStyle w:val="Title"/>
+      </w:pPr>
+      <w:r>
         <w:t>LAPORAN TUGAS AKHIR</w:t>
       </w:r>
     </w:p>
@@ -43,16 +36,9 @@
     </w:p>
     <w:p>
       <w:pPr>
-        <w:keepNext/>
-        <w:spacing w:before="240" w:after="120" w:line="276" w:lineRule="auto"/>
-      </w:pPr>
-      <w:r>
-        <w:rPr>
-          <w:rFonts w:ascii="Times New Roman" w:hAnsi="Times New Roman"/>
-          <w:b/>
-          <w:color w:val="333333"/>
-          <w:sz w:val="24"/>
-        </w:rPr>
+        <w:pStyle w:val="Heading3"/>
+      </w:pPr>
+      <w:r>
         <w:t>PERNYATAAN IDENTITAS AKADEMIK</w:t>
       </w:r>
     </w:p>
@@ -197,16 +183,9 @@
     </w:p>
     <w:p>
       <w:pPr>
-        <w:keepNext/>
-        <w:spacing w:before="240" w:after="120" w:line="276" w:lineRule="auto"/>
-      </w:pPr>
-      <w:r>
-        <w:rPr>
-          <w:rFonts w:ascii="Times New Roman" w:hAnsi="Times New Roman"/>
-          <w:b/>
-          <w:color w:val="003366"/>
-          <w:sz w:val="28"/>
-        </w:rPr>
+        <w:pStyle w:val="Heading2"/>
+      </w:pPr>
+      <w:r>
         <w:t>LEMBAR PENGESAHAN</w:t>
       </w:r>
     </w:p>
@@ -455,16 +434,9 @@
     </w:p>
     <w:p>
       <w:pPr>
-        <w:keepNext/>
-        <w:spacing w:before="240" w:after="120" w:line="276" w:lineRule="auto"/>
-      </w:pPr>
-      <w:r>
-        <w:rPr>
-          <w:rFonts w:ascii="Times New Roman" w:hAnsi="Times New Roman"/>
-          <w:b/>
-          <w:color w:val="003366"/>
-          <w:sz w:val="28"/>
-        </w:rPr>
+        <w:pStyle w:val="Heading2"/>
+      </w:pPr>
+      <w:r>
         <w:t>PERNYATAAN KEASLIAN KARYA</w:t>
       </w:r>
     </w:p>
@@ -551,16 +523,9 @@
     </w:p>
     <w:p>
       <w:pPr>
-        <w:keepNext/>
-        <w:spacing w:before="240" w:after="120" w:line="276" w:lineRule="auto"/>
-      </w:pPr>
-      <w:r>
-        <w:rPr>
-          <w:rFonts w:ascii="Times New Roman" w:hAnsi="Times New Roman"/>
-          <w:b/>
-          <w:color w:val="003366"/>
-          <w:sz w:val="28"/>
-        </w:rPr>
+        <w:pStyle w:val="Heading2"/>
+      </w:pPr>
+      <w:r>
         <w:t>KATA PENGANTAR</w:t>
       </w:r>
     </w:p>
@@ -675,16 +640,9 @@
     </w:p>
     <w:p>
       <w:pPr>
-        <w:keepNext/>
-        <w:spacing w:before="240" w:after="120" w:line="276" w:lineRule="auto"/>
-      </w:pPr>
-      <w:r>
-        <w:rPr>
-          <w:rFonts w:ascii="Times New Roman" w:hAnsi="Times New Roman"/>
-          <w:b/>
-          <w:color w:val="003366"/>
-          <w:sz w:val="28"/>
-        </w:rPr>
+        <w:pStyle w:val="Heading2"/>
+      </w:pPr>
+      <w:r>
         <w:t>ABSTRAK</w:t>
       </w:r>
     </w:p>
@@ -740,16 +698,9 @@
     </w:p>
     <w:p>
       <w:pPr>
-        <w:keepNext/>
-        <w:spacing w:before="240" w:after="120" w:line="276" w:lineRule="auto"/>
-      </w:pPr>
-      <w:r>
-        <w:rPr>
-          <w:rFonts w:ascii="Times New Roman" w:hAnsi="Times New Roman"/>
-          <w:b/>
-          <w:color w:val="003366"/>
-          <w:sz w:val="28"/>
-        </w:rPr>
+        <w:pStyle w:val="Heading2"/>
+      </w:pPr>
+      <w:r>
         <w:t>ABSTRACT</w:t>
       </w:r>
     </w:p>
@@ -805,16 +756,9 @@
     </w:p>
     <w:p>
       <w:pPr>
-        <w:keepNext/>
-        <w:spacing w:before="240" w:after="120" w:line="276" w:lineRule="auto"/>
-      </w:pPr>
-      <w:r>
-        <w:rPr>
-          <w:rFonts w:ascii="Times New Roman" w:hAnsi="Times New Roman"/>
-          <w:b/>
-          <w:color w:val="003366"/>
-          <w:sz w:val="28"/>
-        </w:rPr>
+        <w:pStyle w:val="Heading2"/>
+      </w:pPr>
+      <w:r>
         <w:t>DAFTAR ISI</w:t>
       </w:r>
     </w:p>
@@ -1492,16 +1436,9 @@
     </w:p>
     <w:p>
       <w:pPr>
-        <w:keepNext/>
-        <w:spacing w:before="240" w:after="120" w:line="276" w:lineRule="auto"/>
-      </w:pPr>
-      <w:r>
-        <w:rPr>
-          <w:rFonts w:ascii="Times New Roman" w:hAnsi="Times New Roman"/>
-          <w:b/>
-          <w:color w:val="003366"/>
-          <w:sz w:val="28"/>
-        </w:rPr>
+        <w:pStyle w:val="Heading2"/>
+      </w:pPr>
+      <w:r>
         <w:t>DAFTAR GAMBAR</w:t>
       </w:r>
     </w:p>
@@ -1742,16 +1679,9 @@
     </w:p>
     <w:p>
       <w:pPr>
-        <w:keepNext/>
-        <w:spacing w:before="240" w:after="120" w:line="276" w:lineRule="auto"/>
-      </w:pPr>
-      <w:r>
-        <w:rPr>
-          <w:rFonts w:ascii="Times New Roman" w:hAnsi="Times New Roman"/>
-          <w:b/>
-          <w:color w:val="003366"/>
-          <w:sz w:val="28"/>
-        </w:rPr>
+        <w:pStyle w:val="Heading2"/>
+      </w:pPr>
+      <w:r>
         <w:t>DAFTAR TABEL</w:t>
       </w:r>
     </w:p>
@@ -1896,16 +1826,9 @@
     </w:p>
     <w:p>
       <w:pPr>
-        <w:keepNext/>
-        <w:spacing w:before="240" w:after="120" w:line="276" w:lineRule="auto"/>
-      </w:pPr>
-      <w:r>
-        <w:rPr>
-          <w:rFonts w:ascii="Times New Roman" w:hAnsi="Times New Roman"/>
-          <w:b/>
-          <w:color w:val="003366"/>
-          <w:sz w:val="28"/>
-        </w:rPr>
+        <w:pStyle w:val="Heading2"/>
+      </w:pPr>
+      <w:r>
         <w:t>DAFTAR SINGKATAN</w:t>
       </w:r>
     </w:p>
@@ -2348,31 +2271,17 @@
     </w:p>
     <w:p>
       <w:pPr>
-        <w:keepNext/>
-        <w:spacing w:before="240" w:after="120" w:line="276" w:lineRule="auto"/>
-      </w:pPr>
-      <w:r>
-        <w:rPr>
-          <w:rFonts w:ascii="Times New Roman" w:hAnsi="Times New Roman"/>
-          <w:b/>
-          <w:color w:val="003366"/>
-          <w:sz w:val="32"/>
-        </w:rPr>
+        <w:pStyle w:val="Heading1"/>
+      </w:pPr>
+      <w:r>
         <w:t>BAB I — PENDAHULUAN</w:t>
       </w:r>
     </w:p>
     <w:p>
       <w:pPr>
-        <w:keepNext/>
-        <w:spacing w:before="240" w:after="120" w:line="276" w:lineRule="auto"/>
-      </w:pPr>
-      <w:r>
-        <w:rPr>
-          <w:rFonts w:ascii="Times New Roman" w:hAnsi="Times New Roman"/>
-          <w:b/>
-          <w:color w:val="003366"/>
-          <w:sz w:val="28"/>
-        </w:rPr>
+        <w:pStyle w:val="Heading2"/>
+      </w:pPr>
+      <w:r>
         <w:t>1.1 Latar Belakang Masalah</w:t>
       </w:r>
     </w:p>
@@ -2459,16 +2368,9 @@
     </w:p>
     <w:p>
       <w:pPr>
-        <w:keepNext/>
-        <w:spacing w:before="240" w:after="120" w:line="276" w:lineRule="auto"/>
-      </w:pPr>
-      <w:r>
-        <w:rPr>
-          <w:rFonts w:ascii="Times New Roman" w:hAnsi="Times New Roman"/>
-          <w:b/>
-          <w:color w:val="003366"/>
-          <w:sz w:val="28"/>
-        </w:rPr>
+        <w:pStyle w:val="Heading2"/>
+      </w:pPr>
+      <w:r>
         <w:t>1.2 Identifikasi Masalah</w:t>
       </w:r>
     </w:p>
@@ -2546,16 +2448,9 @@
     </w:p>
     <w:p>
       <w:pPr>
-        <w:keepNext/>
-        <w:spacing w:before="240" w:after="120" w:line="276" w:lineRule="auto"/>
-      </w:pPr>
-      <w:r>
-        <w:rPr>
-          <w:rFonts w:ascii="Times New Roman" w:hAnsi="Times New Roman"/>
-          <w:b/>
-          <w:color w:val="003366"/>
-          <w:sz w:val="28"/>
-        </w:rPr>
+        <w:pStyle w:val="Heading2"/>
+      </w:pPr>
+      <w:r>
         <w:t>1.3 Rumusan Masalah</w:t>
       </w:r>
     </w:p>
@@ -2614,16 +2509,9 @@
     </w:p>
     <w:p>
       <w:pPr>
-        <w:keepNext/>
-        <w:spacing w:before="240" w:after="120" w:line="276" w:lineRule="auto"/>
-      </w:pPr>
-      <w:r>
-        <w:rPr>
-          <w:rFonts w:ascii="Times New Roman" w:hAnsi="Times New Roman"/>
-          <w:b/>
-          <w:color w:val="003366"/>
-          <w:sz w:val="28"/>
-        </w:rPr>
+        <w:pStyle w:val="Heading2"/>
+      </w:pPr>
+      <w:r>
         <w:t>1.4 Batasan Penelitian dan Ruang Lingkup Faktual</w:t>
       </w:r>
     </w:p>
@@ -3624,16 +3512,9 @@
     <w:p/>
     <w:p>
       <w:pPr>
-        <w:keepNext/>
-        <w:spacing w:before="240" w:after="120" w:line="276" w:lineRule="auto"/>
-      </w:pPr>
-      <w:r>
-        <w:rPr>
-          <w:rFonts w:ascii="Times New Roman" w:hAnsi="Times New Roman"/>
-          <w:b/>
-          <w:color w:val="003366"/>
-          <w:sz w:val="28"/>
-        </w:rPr>
+        <w:pStyle w:val="Heading2"/>
+      </w:pPr>
+      <w:r>
         <w:t>1.5 Tujuan Penelitian</w:t>
       </w:r>
     </w:p>
@@ -3692,16 +3573,9 @@
     </w:p>
     <w:p>
       <w:pPr>
-        <w:keepNext/>
-        <w:spacing w:before="240" w:after="120" w:line="276" w:lineRule="auto"/>
-      </w:pPr>
-      <w:r>
-        <w:rPr>
-          <w:rFonts w:ascii="Times New Roman" w:hAnsi="Times New Roman"/>
-          <w:b/>
-          <w:color w:val="003366"/>
-          <w:sz w:val="28"/>
-        </w:rPr>
+        <w:pStyle w:val="Heading2"/>
+      </w:pPr>
+      <w:r>
         <w:t>1.6 Manfaat Penelitian</w:t>
       </w:r>
     </w:p>
@@ -3783,16 +3657,9 @@
     </w:p>
     <w:p>
       <w:pPr>
-        <w:keepNext/>
-        <w:spacing w:before="240" w:after="120" w:line="276" w:lineRule="auto"/>
-      </w:pPr>
-      <w:r>
-        <w:rPr>
-          <w:rFonts w:ascii="Times New Roman" w:hAnsi="Times New Roman"/>
-          <w:b/>
-          <w:color w:val="003366"/>
-          <w:sz w:val="28"/>
-        </w:rPr>
+        <w:pStyle w:val="Heading2"/>
+      </w:pPr>
+      <w:r>
         <w:t>1.7 Metodologi Pengembangan dan Verifikasi</w:t>
       </w:r>
     </w:p>
@@ -3902,16 +3769,9 @@
     </w:p>
     <w:p>
       <w:pPr>
-        <w:keepNext/>
-        <w:spacing w:before="240" w:after="120" w:line="276" w:lineRule="auto"/>
-      </w:pPr>
-      <w:r>
-        <w:rPr>
-          <w:rFonts w:ascii="Times New Roman" w:hAnsi="Times New Roman"/>
-          <w:b/>
-          <w:color w:val="003366"/>
-          <w:sz w:val="28"/>
-        </w:rPr>
+        <w:pStyle w:val="Heading2"/>
+      </w:pPr>
+      <w:r>
         <w:t>1.8 Sistematika Penulisan</w:t>
       </w:r>
     </w:p>
@@ -4010,31 +3870,17 @@
     </w:p>
     <w:p>
       <w:pPr>
-        <w:keepNext/>
-        <w:spacing w:before="240" w:after="120" w:line="276" w:lineRule="auto"/>
-      </w:pPr>
-      <w:r>
-        <w:rPr>
-          <w:rFonts w:ascii="Times New Roman" w:hAnsi="Times New Roman"/>
-          <w:b/>
-          <w:color w:val="003366"/>
-          <w:sz w:val="32"/>
-        </w:rPr>
+        <w:pStyle w:val="Heading1"/>
+      </w:pPr>
+      <w:r>
         <w:t>BAB II — LANDASAN TEORI</w:t>
       </w:r>
     </w:p>
     <w:p>
       <w:pPr>
-        <w:keepNext/>
-        <w:spacing w:before="240" w:after="120" w:line="276" w:lineRule="auto"/>
-      </w:pPr>
-      <w:r>
-        <w:rPr>
-          <w:rFonts w:ascii="Times New Roman" w:hAnsi="Times New Roman"/>
-          <w:b/>
-          <w:color w:val="003366"/>
-          <w:sz w:val="28"/>
-        </w:rPr>
+        <w:pStyle w:val="Heading2"/>
+      </w:pPr>
+      <w:r>
         <w:t>2.1 Teknologi Hukum (*Legal Technology*)</w:t>
       </w:r>
     </w:p>
@@ -4056,16 +3902,9 @@
     </w:p>
     <w:p>
       <w:pPr>
-        <w:keepNext/>
-        <w:spacing w:before="240" w:after="120" w:line="276" w:lineRule="auto"/>
-      </w:pPr>
-      <w:r>
-        <w:rPr>
-          <w:rFonts w:ascii="Times New Roman" w:hAnsi="Times New Roman"/>
-          <w:b/>
-          <w:color w:val="003366"/>
-          <w:sz w:val="28"/>
-        </w:rPr>
+        <w:pStyle w:val="Heading2"/>
+      </w:pPr>
+      <w:r>
         <w:t>2.2 Corporate Intake dan Kerangka Kerja Beneficial Owner (BO)</w:t>
       </w:r>
     </w:p>
@@ -4087,16 +3926,9 @@
     </w:p>
     <w:p>
       <w:pPr>
-        <w:keepNext/>
-        <w:spacing w:before="240" w:after="120" w:line="276" w:lineRule="auto"/>
-      </w:pPr>
-      <w:r>
-        <w:rPr>
-          <w:rFonts w:ascii="Times New Roman" w:hAnsi="Times New Roman"/>
-          <w:b/>
-          <w:color w:val="003366"/>
-          <w:sz w:val="28"/>
-        </w:rPr>
+        <w:pStyle w:val="Heading2"/>
+      </w:pPr>
+      <w:r>
         <w:t>2.3 Mekanisme Escrow dan Milestone Pembayaran Hukum</w:t>
       </w:r>
     </w:p>
@@ -4113,21 +3945,14 @@
         <w:spacing w:line="360" w:lineRule="auto" w:after="120"/>
       </w:pPr>
       <w:r>
-        <w:t>Struktur pembayaran *escrow* pada layanan hukum korporasi umumnya dibagi ke dalam beberapa tahapan (*payment milestones*). Setiap *milestone* merepresentasikan persentase atau tahapan pengerjaan tertentu (seperti verifikasi nama perseroan, pemrosesan di Kemenkumham, dan pengesahan akta). Dana yang tersimpan pada akun *escrow* berada dalam status teruji (*HELD_IN_ESCROW*) dan hanya dapat dicairkan (*RELEASED*) atau dikembalikan (*REFUNDED*) setelah memenuhi syarat penandatanganan dokumen atau persetujuan pihak yang berwenang.</w:t>
-      </w:r>
-    </w:p>
-    <w:p>
-      <w:pPr>
-        <w:keepNext/>
-        <w:spacing w:before="240" w:after="120" w:line="276" w:lineRule="auto"/>
-      </w:pPr>
-      <w:r>
-        <w:rPr>
-          <w:rFonts w:ascii="Times New Roman" w:hAnsi="Times New Roman"/>
-          <w:b/>
-          <w:color w:val="003366"/>
-          <w:sz w:val="28"/>
-        </w:rPr>
+        <w:t>Struktur pembayaran *escrow* pada layanan hukum korporasi umumnya dibagi ke dalam beberapa tahapan (*payment milestones*). Setiap *milestone* merepresentasikan persentase atau tahapan pengerjaan tertentu (seperti verifikasi nama perseroan, pemrosesan di Kemenkumham, dan pengesahan akta). Dana yang tersimpan pada akun *escrow* berada dalam status teruji (*HELD_IN_ESCROW*) meialui pemicu transaksi dan hanya dapat dicairkan (*RELEASED*) atau dikembalikan (*REFUNDED*) setelah memenuhi syarat penandatanganan dokumen atau persetujuan pihak yang berwenang.</w:t>
+      </w:r>
+    </w:p>
+    <w:p>
+      <w:pPr>
+        <w:pStyle w:val="Heading2"/>
+      </w:pPr>
+      <w:r>
         <w:t>2.4 Database Relasional PostgreSQL dan Sifat ACID</w:t>
       </w:r>
     </w:p>
@@ -4213,16 +4038,9 @@
     </w:p>
     <w:p>
       <w:pPr>
-        <w:keepNext/>
-        <w:spacing w:before="240" w:after="120" w:line="276" w:lineRule="auto"/>
-      </w:pPr>
-      <w:r>
-        <w:rPr>
-          <w:rFonts w:ascii="Times New Roman" w:hAnsi="Times New Roman"/>
-          <w:b/>
-          <w:color w:val="003366"/>
-          <w:sz w:val="28"/>
-        </w:rPr>
+        <w:pStyle w:val="Heading2"/>
+      </w:pPr>
+      <w:r>
         <w:t>2.5 Idempotensi, Replay Protection, dan HMAC SHA-256</w:t>
       </w:r>
     </w:p>
@@ -4276,16 +4094,9 @@
     </w:p>
     <w:p>
       <w:pPr>
-        <w:keepNext/>
-        <w:spacing w:before="240" w:after="120" w:line="276" w:lineRule="auto"/>
-      </w:pPr>
-      <w:r>
-        <w:rPr>
-          <w:rFonts w:ascii="Times New Roman" w:hAnsi="Times New Roman"/>
-          <w:b/>
-          <w:color w:val="003366"/>
-          <w:sz w:val="28"/>
-        </w:rPr>
+        <w:pStyle w:val="Heading2"/>
+      </w:pPr>
+      <w:r>
         <w:t>2.6 Arsitektur Supabase: GoTrue, PostgREST, RLS, dan Edge Functions</w:t>
       </w:r>
     </w:p>
@@ -4363,16 +4174,9 @@
     </w:p>
     <w:p>
       <w:pPr>
-        <w:keepNext/>
-        <w:spacing w:before="240" w:after="120" w:line="276" w:lineRule="auto"/>
-      </w:pPr>
-      <w:r>
-        <w:rPr>
-          <w:rFonts w:ascii="Times New Roman" w:hAnsi="Times New Roman"/>
-          <w:b/>
-          <w:color w:val="003366"/>
-          <w:sz w:val="28"/>
-        </w:rPr>
+        <w:pStyle w:val="Heading2"/>
+      </w:pPr>
+      <w:r>
         <w:t>2.7 Pola Desain Integration Layer dan Single-Flight Mutation State</w:t>
       </w:r>
     </w:p>
@@ -4394,17 +4198,10 @@
     </w:p>
     <w:p>
       <w:pPr>
-        <w:keepNext/>
-        <w:spacing w:before="240" w:after="120" w:line="276" w:lineRule="auto"/>
-      </w:pPr>
-      <w:r>
-        <w:rPr>
-          <w:rFonts w:ascii="Times New Roman" w:hAnsi="Times New Roman"/>
-          <w:b/>
-          <w:color w:val="003366"/>
-          <w:sz w:val="28"/>
-        </w:rPr>
-        <w:t>2.8 Pengujian Berbasis Bukti Faktual dan Audit Forensik</w:t>
+        <w:pStyle w:val="Heading2"/>
+      </w:pPr>
+      <w:r>
+        <w:t>2.8 Pengujian Berbasis Bukti Faktual dan Verifikasi Perangkat Lunak</w:t>
       </w:r>
     </w:p>
     <w:p>
@@ -4412,7 +4209,7 @@
         <w:spacing w:line="360" w:lineRule="auto" w:after="120"/>
       </w:pPr>
       <w:r>
-        <w:t>Dalam rekayasa perangkat lunak akademik, kebenaran klaim implementasi sistem tidak boleh bersumber dari asumsi, rancangan teoritis, atau narasi dokumentasi semata. Perangkat lunak yang dikembangkan wajib diaudit menggunakan metode audit forensik 360-derajat (*360-degree forensic audit*) (Pressman &amp; Maxim, 2020).</w:t>
+        <w:t>Dalam rekayasa perangkat lunak akademik, kebenaran klaim implementasi sistem harus didukung oleh prinsip verifikasi dan validasi perangkat lunak secara menyeluruh (Pressman &amp; Maxim, 2020). Perangkat lunak tidak boleh dinilai hanya dari klaim naratif semata, melainkan wajib dibuktikan melalui eksekusi pengujian empiris.</w:t>
       </w:r>
     </w:p>
     <w:p>
@@ -4420,7 +4217,7 @@
         <w:spacing w:line="360" w:lineRule="auto" w:after="120"/>
       </w:pPr>
       <w:r>
-        <w:t>Audit forensik membandingkan secara langsung antara kewajiban normatif (spesifikasi kebutuhan), bukti komit repositori Git, eksekusi perintah pengujian otomatis (*automated test suites*), dan ketersediaan simbol (*symbol map verification*). Dalam konteks pengujian lokal (*ACCEPTED_LOCAL*), pengujian basis data dilaksanakan menggunakan transaksi *runtime SQL* yang sengaja diakhiri dengan perintah `ROLLBACK` agar tidak mencemari lingkungan basis data pengujian, sambil memastikan bahwa pemicu (*triggers*), aturan RLS, dan penguncian mutex pada objek teruji berfungsi sesuai spesifikasi.</w:t>
+        <w:t>Pada proyek Justifiqa, metode audit forensik 360-derajat (*360-degree forensic audit*) diterapkan sebagai metode audit internal berbasis bukti faktual (*internal evidence-driven audit method*). Metode internal ini membandingkan secara langsung antara kewajiban normatif (spesifikasi kebutuhan), bukti komit repositori Git, eksekusi perintah pengujian otomatis (*automated test suites*), dan ketersediaan pemetaan simbol (*symbol map verification*). Dalam konteks pengujian lokal (*ACCEPTED_LOCAL*), pengujian basis data dilaksanakan menggunakan transaksi *runtime SQL* yang sengaja diakhiri dengan perintah `ROLLBACK` agar tidak mencemari lingkungan basis data pengujian, sambil memastikan bahwa pemicu (*triggers*), aturan RLS, dan penguncian mutex pada objek teruji berfungsi sesuai spesifikasi.</w:t>
       </w:r>
     </w:p>
     <w:p>
@@ -4430,31 +4227,17 @@
     </w:p>
     <w:p>
       <w:pPr>
-        <w:keepNext/>
-        <w:spacing w:before="240" w:after="120" w:line="276" w:lineRule="auto"/>
-      </w:pPr>
-      <w:r>
-        <w:rPr>
-          <w:rFonts w:ascii="Times New Roman" w:hAnsi="Times New Roman"/>
-          <w:b/>
-          <w:color w:val="003366"/>
-          <w:sz w:val="32"/>
-        </w:rPr>
+        <w:pStyle w:val="Heading1"/>
+      </w:pPr>
+      <w:r>
         <w:t>BAB III — ANALISIS DAN PERANCANGAN</w:t>
       </w:r>
     </w:p>
     <w:p>
       <w:pPr>
-        <w:keepNext/>
-        <w:spacing w:before="240" w:after="120" w:line="276" w:lineRule="auto"/>
-      </w:pPr>
-      <w:r>
-        <w:rPr>
-          <w:rFonts w:ascii="Times New Roman" w:hAnsi="Times New Roman"/>
-          <w:b/>
-          <w:color w:val="003366"/>
-          <w:sz w:val="28"/>
-        </w:rPr>
+        <w:pStyle w:val="Heading2"/>
+      </w:pPr>
+      <w:r>
         <w:t>3.1 Gambaran Umum Justifiqa</w:t>
       </w:r>
     </w:p>
@@ -4508,16 +4291,9 @@
     </w:p>
     <w:p>
       <w:pPr>
-        <w:keepNext/>
-        <w:spacing w:before="240" w:after="120" w:line="276" w:lineRule="auto"/>
-      </w:pPr>
-      <w:r>
-        <w:rPr>
-          <w:rFonts w:ascii="Times New Roman" w:hAnsi="Times New Roman"/>
-          <w:b/>
-          <w:color w:val="003366"/>
-          <w:sz w:val="28"/>
-        </w:rPr>
+        <w:pStyle w:val="Heading2"/>
+      </w:pPr>
+      <w:r>
         <w:t>3.2 Analisis Kebutuhan Aktor dan Peran Sistem</w:t>
       </w:r>
     </w:p>
@@ -4595,16 +4371,9 @@
     </w:p>
     <w:p>
       <w:pPr>
-        <w:keepNext/>
-        <w:spacing w:before="240" w:after="120" w:line="276" w:lineRule="auto"/>
-      </w:pPr>
-      <w:r>
-        <w:rPr>
-          <w:rFonts w:ascii="Times New Roman" w:hAnsi="Times New Roman"/>
-          <w:b/>
-          <w:color w:val="003366"/>
-          <w:sz w:val="28"/>
-        </w:rPr>
+        <w:pStyle w:val="Heading2"/>
+      </w:pPr>
+      <w:r>
         <w:t>3.3 Analisis Kebutuhan Fungsional (Use Case)</w:t>
       </w:r>
     </w:p>
@@ -5285,16 +5054,9 @@
     <w:p/>
     <w:p>
       <w:pPr>
-        <w:keepNext/>
-        <w:spacing w:before="240" w:after="120" w:line="276" w:lineRule="auto"/>
-      </w:pPr>
-      <w:r>
-        <w:rPr>
-          <w:rFonts w:ascii="Times New Roman" w:hAnsi="Times New Roman"/>
-          <w:b/>
-          <w:color w:val="003366"/>
-          <w:sz w:val="28"/>
-        </w:rPr>
+        <w:pStyle w:val="Heading2"/>
+      </w:pPr>
+      <w:r>
         <w:t>3.4 Analisis Kebutuhan Non-Fungsional</w:t>
       </w:r>
     </w:p>
@@ -5591,16 +5353,9 @@
     <w:p/>
     <w:p>
       <w:pPr>
-        <w:keepNext/>
-        <w:spacing w:before="240" w:after="120" w:line="276" w:lineRule="auto"/>
-      </w:pPr>
-      <w:r>
-        <w:rPr>
-          <w:rFonts w:ascii="Times New Roman" w:hAnsi="Times New Roman"/>
-          <w:b/>
-          <w:color w:val="003366"/>
-          <w:sz w:val="28"/>
-        </w:rPr>
+        <w:pStyle w:val="Heading2"/>
+      </w:pPr>
+      <w:r>
         <w:t>3.5 Arsitektur Berlapis Sistem Justifiqa</w:t>
       </w:r>
     </w:p>
@@ -5741,16 +5496,9 @@
     </w:p>
     <w:p>
       <w:pPr>
-        <w:keepNext/>
-        <w:spacing w:before="240" w:after="120" w:line="276" w:lineRule="auto"/>
-      </w:pPr>
-      <w:r>
-        <w:rPr>
-          <w:rFonts w:ascii="Times New Roman" w:hAnsi="Times New Roman"/>
-          <w:b/>
-          <w:color w:val="003366"/>
-          <w:sz w:val="28"/>
-        </w:rPr>
+        <w:pStyle w:val="Heading2"/>
+      </w:pPr>
+      <w:r>
         <w:t>3.6 Perancangan Skema Database PostgreSQL (ERD)</w:t>
       </w:r>
     </w:p>
@@ -6440,16 +6188,9 @@
     <w:p/>
     <w:p>
       <w:pPr>
-        <w:keepNext/>
-        <w:spacing w:before="240" w:after="120" w:line="276" w:lineRule="auto"/>
-      </w:pPr>
-      <w:r>
-        <w:rPr>
-          <w:rFonts w:ascii="Times New Roman" w:hAnsi="Times New Roman"/>
-          <w:b/>
-          <w:color w:val="003366"/>
-          <w:sz w:val="28"/>
-        </w:rPr>
+        <w:pStyle w:val="Heading2"/>
+      </w:pPr>
+      <w:r>
         <w:t>3.7 State Model dan Transisi Status Terikat Entitas</w:t>
       </w:r>
     </w:p>
@@ -6612,16 +6353,9 @@
     </w:p>
     <w:p>
       <w:pPr>
-        <w:keepNext/>
-        <w:spacing w:before="240" w:after="120" w:line="276" w:lineRule="auto"/>
-      </w:pPr>
-      <w:r>
-        <w:rPr>
-          <w:rFonts w:ascii="Times New Roman" w:hAnsi="Times New Roman"/>
-          <w:b/>
-          <w:color w:val="003366"/>
-          <w:sz w:val="28"/>
-        </w:rPr>
+        <w:pStyle w:val="Heading2"/>
+      </w:pPr>
+      <w:r>
         <w:t>3.8 Perancangan Keamanan Data, Access Control List (ACL), dan RLS</w:t>
       </w:r>
     </w:p>
@@ -6683,16 +6417,9 @@
     </w:p>
     <w:p>
       <w:pPr>
-        <w:keepNext/>
-        <w:spacing w:before="240" w:after="120" w:line="276" w:lineRule="auto"/>
-      </w:pPr>
-      <w:r>
-        <w:rPr>
-          <w:rFonts w:ascii="Times New Roman" w:hAnsi="Times New Roman"/>
-          <w:b/>
-          <w:color w:val="003366"/>
-          <w:sz w:val="28"/>
-        </w:rPr>
+        <w:pStyle w:val="Heading2"/>
+      </w:pPr>
+      <w:r>
         <w:t>3.9 Perancangan Idempotensi dan Penguncian Concurrency (Mutex)</w:t>
       </w:r>
     </w:p>
@@ -6738,16 +6465,9 @@
     </w:p>
     <w:p>
       <w:pPr>
-        <w:keepNext/>
-        <w:spacing w:before="240" w:after="120" w:line="276" w:lineRule="auto"/>
-      </w:pPr>
-      <w:r>
-        <w:rPr>
-          <w:rFonts w:ascii="Times New Roman" w:hAnsi="Times New Roman"/>
-          <w:b/>
-          <w:color w:val="003366"/>
-          <w:sz w:val="28"/>
-        </w:rPr>
+        <w:pStyle w:val="Heading2"/>
+      </w:pPr>
+      <w:r>
         <w:t>3.10 Perancangan UI Corporate Intake/Escrow &amp; Presentation Page</w:t>
       </w:r>
     </w:p>
@@ -6891,16 +6611,9 @@
     </w:p>
     <w:p>
       <w:pPr>
-        <w:keepNext/>
-        <w:spacing w:before="240" w:after="120" w:line="276" w:lineRule="auto"/>
-      </w:pPr>
-      <w:r>
-        <w:rPr>
-          <w:rFonts w:ascii="Times New Roman" w:hAnsi="Times New Roman"/>
-          <w:b/>
-          <w:color w:val="003366"/>
-          <w:sz w:val="28"/>
-        </w:rPr>
+        <w:pStyle w:val="Heading2"/>
+      </w:pPr>
+      <w:r>
         <w:t>3.11 Pemisahan Target Architecture versus As-Built Scope</w:t>
       </w:r>
     </w:p>
@@ -6964,16 +6677,9 @@
     </w:p>
     <w:p>
       <w:pPr>
-        <w:keepNext/>
-        <w:spacing w:before="240" w:after="120" w:line="276" w:lineRule="auto"/>
-      </w:pPr>
-      <w:r>
-        <w:rPr>
-          <w:rFonts w:ascii="Times New Roman" w:hAnsi="Times New Roman"/>
-          <w:b/>
-          <w:color w:val="003366"/>
-          <w:sz w:val="28"/>
-        </w:rPr>
+        <w:pStyle w:val="Heading2"/>
+      </w:pPr>
+      <w:r>
         <w:t>3.12 Metode Batching dan Audit Gate</w:t>
       </w:r>
     </w:p>
@@ -7036,31 +6742,17 @@
     </w:p>
     <w:p>
       <w:pPr>
-        <w:keepNext/>
-        <w:spacing w:before="240" w:after="120" w:line="276" w:lineRule="auto"/>
-      </w:pPr>
-      <w:r>
-        <w:rPr>
-          <w:rFonts w:ascii="Times New Roman" w:hAnsi="Times New Roman"/>
-          <w:b/>
-          <w:color w:val="003366"/>
-          <w:sz w:val="32"/>
-        </w:rPr>
+        <w:pStyle w:val="Heading1"/>
+      </w:pPr>
+      <w:r>
         <w:t>BAB IV — IMPLEMENTASI DAN PENGUJIAN</w:t>
       </w:r>
     </w:p>
     <w:p>
       <w:pPr>
-        <w:keepNext/>
-        <w:spacing w:before="240" w:after="120" w:line="276" w:lineRule="auto"/>
-      </w:pPr>
-      <w:r>
-        <w:rPr>
-          <w:rFonts w:ascii="Times New Roman" w:hAnsi="Times New Roman"/>
-          <w:b/>
-          <w:color w:val="003366"/>
-          <w:sz w:val="28"/>
-        </w:rPr>
+        <w:pStyle w:val="Heading2"/>
+      </w:pPr>
+      <w:r>
         <w:t>4.1 Lingkungan Pengoperasian dan Teknologi Utama</w:t>
       </w:r>
     </w:p>
@@ -7162,16 +6854,9 @@
     </w:p>
     <w:p>
       <w:pPr>
-        <w:keepNext/>
-        <w:spacing w:before="240" w:after="120" w:line="276" w:lineRule="auto"/>
-      </w:pPr>
-      <w:r>
-        <w:rPr>
-          <w:rFonts w:ascii="Times New Roman" w:hAnsi="Times New Roman"/>
-          <w:b/>
-          <w:color w:val="003366"/>
-          <w:sz w:val="28"/>
-        </w:rPr>
+        <w:pStyle w:val="Heading2"/>
+      </w:pPr>
+      <w:r>
         <w:t>4.2 Struktur Repository dan Pengorganisasian Kode</w:t>
       </w:r>
     </w:p>
@@ -7230,16 +6915,9 @@
     </w:p>
     <w:p>
       <w:pPr>
-        <w:keepNext/>
-        <w:spacing w:before="240" w:after="120" w:line="276" w:lineRule="auto"/>
-      </w:pPr>
-      <w:r>
-        <w:rPr>
-          <w:rFonts w:ascii="Times New Roman" w:hAnsi="Times New Roman"/>
-          <w:b/>
-          <w:color w:val="003366"/>
-          <w:sz w:val="28"/>
-        </w:rPr>
+        <w:pStyle w:val="Heading2"/>
+      </w:pPr>
+      <w:r>
         <w:t>4.3 Implementasi Backend Hardened Contract (Phase 2)</w:t>
       </w:r>
     </w:p>
@@ -7914,16 +7592,9 @@
     <w:p/>
     <w:p>
       <w:pPr>
-        <w:keepNext/>
-        <w:spacing w:before="240" w:after="120" w:line="276" w:lineRule="auto"/>
-      </w:pPr>
-      <w:r>
-        <w:rPr>
-          <w:rFonts w:ascii="Times New Roman" w:hAnsi="Times New Roman"/>
-          <w:b/>
-          <w:color w:val="003366"/>
-          <w:sz w:val="28"/>
-        </w:rPr>
+        <w:pStyle w:val="Heading2"/>
+      </w:pPr>
+      <w:r>
         <w:t>4.4 Implementasi Versioned Corporate Pricing Catalog</w:t>
       </w:r>
     </w:p>
@@ -7980,16 +7651,9 @@
     </w:p>
     <w:p>
       <w:pPr>
-        <w:keepNext/>
-        <w:spacing w:before="240" w:after="120" w:line="276" w:lineRule="auto"/>
-      </w:pPr>
-      <w:r>
-        <w:rPr>
-          <w:rFonts w:ascii="Times New Roman" w:hAnsi="Times New Roman"/>
-          <w:b/>
-          <w:color w:val="003366"/>
-          <w:sz w:val="28"/>
-        </w:rPr>
+        <w:pStyle w:val="Heading2"/>
+      </w:pPr>
+      <w:r>
         <w:t>4.5 Implementasi Atomic Corporate Intake RPC</w:t>
       </w:r>
     </w:p>
@@ -8046,23 +7710,21 @@
         <w:br/>
         <w:t xml:space="preserve">  PERFORM pg_advisory_xact_lock(hashtext(p_order_id::text));</w:t>
         <w:br/>
-        <w:t xml:space="preserve">  </w:t>
         <w:br/>
         <w:t xml:space="preserve">  -- 2. Ambil katalog harga aktif secara resmi</w:t>
         <w:br/>
-        <w:t xml:space="preserve">  SELECT catalog_id INTO v_catalog_id </w:t>
+        <w:t xml:space="preserve">  SELECT catalog_id INTO v_catalog_id</w:t>
         <w:br/>
-        <w:t xml:space="preserve">  FROM public.corporate_pricing_catalogs </w:t>
+        <w:t xml:space="preserve">  FROM public.corporate_pricing_catalogs</w:t>
         <w:br/>
         <w:t xml:space="preserve">  WHERE is_active = true LIMIT 1;</w:t>
         <w:br/>
-        <w:t xml:space="preserve">  </w:t>
         <w:br/>
-        <w:t xml:space="preserve">  -- 3. Buat entitas service_orders (status = PAYMENT_PENDING), </w:t>
+        <w:t xml:space="preserve">  -- 3. Buat entitas service_orders (status = PAYMENT_PENDING),</w:t>
         <w:br/>
-        <w:t xml:space="preserve">  --    corporate_service_cases (current_stage = DRAFT), </w:t>
+        <w:t xml:space="preserve">  --    corporate_service_cases (current_stage = DRAFT),</w:t>
         <w:br/>
-        <w:t xml:space="preserve">  --    escrow_transactions (status = PENDING_PAYMENT), </w:t>
+        <w:t xml:space="preserve">  --    escrow_transactions (status = PENDING_PAYMENT),</w:t>
         <w:br/>
         <w:t xml:space="preserve">  --    dan payment_milestones (status = PENDING)</w:t>
         <w:br/>
@@ -8122,16 +7784,9 @@
     </w:p>
     <w:p>
       <w:pPr>
-        <w:keepNext/>
-        <w:spacing w:before="240" w:after="120" w:line="276" w:lineRule="auto"/>
-      </w:pPr>
-      <w:r>
-        <w:rPr>
-          <w:rFonts w:ascii="Times New Roman" w:hAnsi="Times New Roman"/>
-          <w:b/>
-          <w:color w:val="003366"/>
-          <w:sz w:val="28"/>
-        </w:rPr>
+        <w:pStyle w:val="Heading2"/>
+      </w:pPr>
+      <w:r>
         <w:t>4.6 Implementasi Protected Beneficial Owner Evidence Boundary</w:t>
       </w:r>
     </w:p>
@@ -8185,16 +7840,9 @@
     </w:p>
     <w:p>
       <w:pPr>
-        <w:keepNext/>
-        <w:spacing w:before="240" w:after="120" w:line="276" w:lineRule="auto"/>
-      </w:pPr>
-      <w:r>
-        <w:rPr>
-          <w:rFonts w:ascii="Times New Roman" w:hAnsi="Times New Roman"/>
-          <w:b/>
-          <w:color w:val="003366"/>
-          <w:sz w:val="28"/>
-        </w:rPr>
+        <w:pStyle w:val="Heading2"/>
+      </w:pPr>
+      <w:r>
         <w:t>4.7 Implementasi Edge Functions Intake &amp; Webhook</w:t>
       </w:r>
     </w:p>
@@ -8240,16 +7888,9 @@
     </w:p>
     <w:p>
       <w:pPr>
-        <w:keepNext/>
-        <w:spacing w:before="240" w:after="120" w:line="276" w:lineRule="auto"/>
-      </w:pPr>
-      <w:r>
-        <w:rPr>
-          <w:rFonts w:ascii="Times New Roman" w:hAnsi="Times New Roman"/>
-          <w:b/>
-          <w:color w:val="003366"/>
-          <w:sz w:val="28"/>
-        </w:rPr>
+        <w:pStyle w:val="Heading2"/>
+      </w:pPr>
+      <w:r>
         <w:t>4.8 Integrasi Frontend Service, Hook, dan Single-Flight Mutation State</w:t>
       </w:r>
     </w:p>
@@ -8303,16 +7944,9 @@
     </w:p>
     <w:p>
       <w:pPr>
-        <w:keepNext/>
-        <w:spacing w:before="240" w:after="120" w:line="276" w:lineRule="auto"/>
-      </w:pPr>
-      <w:r>
-        <w:rPr>
-          <w:rFonts w:ascii="Times New Roman" w:hAnsi="Times New Roman"/>
-          <w:b/>
-          <w:color w:val="003366"/>
-          <w:sz w:val="28"/>
-        </w:rPr>
+        <w:pStyle w:val="Heading2"/>
+      </w:pPr>
+      <w:r>
         <w:t>4.9 Implementasi Corporate Escrow Settlement</w:t>
       </w:r>
     </w:p>
@@ -8379,16 +8013,9 @@
     </w:p>
     <w:p>
       <w:pPr>
-        <w:keepNext/>
-        <w:spacing w:before="240" w:after="120" w:line="276" w:lineRule="auto"/>
-      </w:pPr>
-      <w:r>
-        <w:rPr>
-          <w:rFonts w:ascii="Times New Roman" w:hAnsi="Times New Roman"/>
-          <w:b/>
-          <w:color w:val="003366"/>
-          <w:sz w:val="28"/>
-        </w:rPr>
+        <w:pStyle w:val="Heading2"/>
+      </w:pPr>
+      <w:r>
         <w:t>4.10 Verifikasi HMAC SHA-256, Timestamp Skew, dan Exact Raw Body</w:t>
       </w:r>
     </w:p>
@@ -8487,16 +8114,9 @@
     </w:p>
     <w:p>
       <w:pPr>
-        <w:keepNext/>
-        <w:spacing w:before="240" w:after="120" w:line="276" w:lineRule="auto"/>
-      </w:pPr>
-      <w:r>
-        <w:rPr>
-          <w:rFonts w:ascii="Times New Roman" w:hAnsi="Times New Roman"/>
-          <w:b/>
-          <w:color w:val="003366"/>
-          <w:sz w:val="28"/>
-        </w:rPr>
+        <w:pStyle w:val="Heading2"/>
+      </w:pPr>
+      <w:r>
         <w:t>4.11 Eksekusi Atomic Settlement RPC dan Transisi Lifecycle Case</w:t>
       </w:r>
     </w:p>
@@ -8510,16 +8130,9 @@
     </w:p>
     <w:p>
       <w:pPr>
-        <w:keepNext/>
-        <w:spacing w:before="240" w:after="120" w:line="276" w:lineRule="auto"/>
-      </w:pPr>
-      <w:r>
-        <w:rPr>
-          <w:rFonts w:ascii="Times New Roman" w:hAnsi="Times New Roman"/>
-          <w:b/>
-          <w:color w:val="003366"/>
-          <w:sz w:val="28"/>
-        </w:rPr>
+        <w:pStyle w:val="Heading2"/>
+      </w:pPr>
+      <w:r>
         <w:t>4.12 Penerapan Authorization Boundary dan Least-Privilege ACL</w:t>
       </w:r>
     </w:p>
@@ -8551,16 +8164,9 @@
     </w:p>
     <w:p>
       <w:pPr>
-        <w:keepNext/>
-        <w:spacing w:before="240" w:after="120" w:line="276" w:lineRule="auto"/>
-      </w:pPr>
-      <w:r>
-        <w:rPr>
-          <w:rFonts w:ascii="Times New Roman" w:hAnsi="Times New Roman"/>
-          <w:b/>
-          <w:color w:val="003366"/>
-          <w:sz w:val="28"/>
-        </w:rPr>
+        <w:pStyle w:val="Heading2"/>
+      </w:pPr>
+      <w:r>
         <w:t>4.13 Implementasi Halaman Presentasi Jujur (`/demo/readiness`)</w:t>
       </w:r>
     </w:p>
@@ -8698,16 +8304,9 @@
     </w:p>
     <w:p>
       <w:pPr>
-        <w:keepNext/>
-        <w:spacing w:before="240" w:after="120" w:line="276" w:lineRule="auto"/>
-      </w:pPr>
-      <w:r>
-        <w:rPr>
-          <w:rFonts w:ascii="Times New Roman" w:hAnsi="Times New Roman"/>
-          <w:b/>
-          <w:color w:val="003366"/>
-          <w:sz w:val="28"/>
-        </w:rPr>
+        <w:pStyle w:val="Heading2"/>
+      </w:pPr>
+      <w:r>
         <w:t>4.14 Hasil Pengujian Otomatis Frontend dan Runtime SQL Transaction</w:t>
       </w:r>
     </w:p>
@@ -9238,16 +8837,9 @@
     <w:p/>
     <w:p>
       <w:pPr>
-        <w:keepNext/>
-        <w:spacing w:before="240" w:after="120" w:line="276" w:lineRule="auto"/>
-      </w:pPr>
-      <w:r>
-        <w:rPr>
-          <w:rFonts w:ascii="Times New Roman" w:hAnsi="Times New Roman"/>
-          <w:b/>
-          <w:color w:val="003366"/>
-          <w:sz w:val="28"/>
-        </w:rPr>
+        <w:pStyle w:val="Heading2"/>
+      </w:pPr>
+      <w:r>
         <w:t>4.15 Matriks Matched Requirements vs Implementation vs Test Results</w:t>
       </w:r>
     </w:p>
@@ -10084,16 +9676,9 @@
     <w:p/>
     <w:p>
       <w:pPr>
-        <w:keepNext/>
-        <w:spacing w:before="240" w:after="120" w:line="276" w:lineRule="auto"/>
-      </w:pPr>
-      <w:r>
-        <w:rPr>
-          <w:rFonts w:ascii="Times New Roman" w:hAnsi="Times New Roman"/>
-          <w:b/>
-          <w:color w:val="003366"/>
-          <w:sz w:val="28"/>
-        </w:rPr>
+        <w:pStyle w:val="Heading2"/>
+      </w:pPr>
+      <w:r>
         <w:t>4.16 Keterbatasan Faktual dan Pembatasan Fitur</w:t>
       </w:r>
     </w:p>
@@ -10127,31 +9712,17 @@
     </w:p>
     <w:p>
       <w:pPr>
-        <w:keepNext/>
-        <w:spacing w:before="240" w:after="120" w:line="276" w:lineRule="auto"/>
-      </w:pPr>
-      <w:r>
-        <w:rPr>
-          <w:rFonts w:ascii="Times New Roman" w:hAnsi="Times New Roman"/>
-          <w:b/>
-          <w:color w:val="003366"/>
-          <w:sz w:val="32"/>
-        </w:rPr>
+        <w:pStyle w:val="Heading1"/>
+      </w:pPr>
+      <w:r>
         <w:t>BAB V — PENUTUP</w:t>
       </w:r>
     </w:p>
     <w:p>
       <w:pPr>
-        <w:keepNext/>
-        <w:spacing w:before="240" w:after="120" w:line="276" w:lineRule="auto"/>
-      </w:pPr>
-      <w:r>
-        <w:rPr>
-          <w:rFonts w:ascii="Times New Roman" w:hAnsi="Times New Roman"/>
-          <w:b/>
-          <w:color w:val="003366"/>
-          <w:sz w:val="28"/>
-        </w:rPr>
+        <w:pStyle w:val="Heading2"/>
+      </w:pPr>
+      <w:r>
         <w:t>5.1 Kesimpulan</w:t>
       </w:r>
     </w:p>
@@ -10245,16 +9816,9 @@
     </w:p>
     <w:p>
       <w:pPr>
-        <w:keepNext/>
-        <w:spacing w:before="240" w:after="120" w:line="276" w:lineRule="auto"/>
-      </w:pPr>
-      <w:r>
-        <w:rPr>
-          <w:rFonts w:ascii="Times New Roman" w:hAnsi="Times New Roman"/>
-          <w:b/>
-          <w:color w:val="003366"/>
-          <w:sz w:val="28"/>
-        </w:rPr>
+        <w:pStyle w:val="Heading2"/>
+      </w:pPr>
+      <w:r>
         <w:t>5.2 Kontribusi Sistem Faktual</w:t>
       </w:r>
     </w:p>
@@ -10348,16 +9912,9 @@
     </w:p>
     <w:p>
       <w:pPr>
-        <w:keepNext/>
-        <w:spacing w:before="240" w:after="120" w:line="276" w:lineRule="auto"/>
-      </w:pPr>
-      <w:r>
-        <w:rPr>
-          <w:rFonts w:ascii="Times New Roman" w:hAnsi="Times New Roman"/>
-          <w:b/>
-          <w:color w:val="003366"/>
-          <w:sz w:val="28"/>
-        </w:rPr>
+        <w:pStyle w:val="Heading2"/>
+      </w:pPr>
+      <w:r>
         <w:t>5.3 Keterbatasan Faktual Sistem</w:t>
       </w:r>
     </w:p>
@@ -10462,21 +10019,14 @@
         <w:t>Verifikasi Visual Berkas DOCX</w:t>
       </w:r>
       <w:r>
-        <w:t>: Berkas laporan format DOCX telah berhasil dibuat secara struktural, namun pengujian rendering visual (*visual render QA*) terblokir karena perangkat lunak LibreOffice/soffice tidak tersedia pada lingkungan eksekusi (`DOCX CREATED; STRUCTURAL CHECK PASSED; VISUAL RENDER QA BLOCKED BY MISSING RENDERER`).</w:t>
-      </w:r>
-    </w:p>
-    <w:p>
-      <w:pPr>
-        <w:keepNext/>
-        <w:spacing w:before="240" w:after="120" w:line="276" w:lineRule="auto"/>
-      </w:pPr>
-      <w:r>
-        <w:rPr>
-          <w:rFonts w:ascii="Times New Roman" w:hAnsi="Times New Roman"/>
-          <w:b/>
-          <w:color w:val="003366"/>
-          <w:sz w:val="28"/>
-        </w:rPr>
+        <w:t>: Berkas laporan format DOCX telah berhasil dibuat secara struktural dengan gaya semantik Word (`Title`, `Heading 1/2/3`, `PAGE` field), namun pengujian rendering visual (*visual render QA*) terblokir karena perangkat lunak LibreOffice/soffice tidak tersedia pada lingkungan eksekusi (`DOCX CREATED; STRUCTURAL CHECK PASSED; VISUAL RENDER QA BLOCKED BY MISSING RENDERER`).</w:t>
+      </w:r>
+    </w:p>
+    <w:p>
+      <w:pPr>
+        <w:pStyle w:val="Heading2"/>
+      </w:pPr>
+      <w:r>
         <w:t>5.4 Saran Pengembangan Masa Depan (*Future Work*)</w:t>
       </w:r>
     </w:p>
@@ -10575,16 +10125,9 @@
     </w:p>
     <w:p>
       <w:pPr>
-        <w:keepNext/>
-        <w:spacing w:before="240" w:after="120" w:line="276" w:lineRule="auto"/>
-      </w:pPr>
-      <w:r>
-        <w:rPr>
-          <w:rFonts w:ascii="Times New Roman" w:hAnsi="Times New Roman"/>
-          <w:b/>
-          <w:color w:val="003366"/>
-          <w:sz w:val="32"/>
-        </w:rPr>
+        <w:pStyle w:val="Heading1"/>
+      </w:pPr>
+      <w:r>
         <w:t>DAFTAR PUSTAKA</w:t>
       </w:r>
     </w:p>
@@ -10683,31 +10226,17 @@
     </w:p>
     <w:p>
       <w:pPr>
-        <w:keepNext/>
-        <w:spacing w:before="240" w:after="120" w:line="276" w:lineRule="auto"/>
-      </w:pPr>
-      <w:r>
-        <w:rPr>
-          <w:rFonts w:ascii="Times New Roman" w:hAnsi="Times New Roman"/>
-          <w:b/>
-          <w:color w:val="003366"/>
-          <w:sz w:val="32"/>
-        </w:rPr>
+        <w:pStyle w:val="Heading1"/>
+      </w:pPr>
+      <w:r>
         <w:t>LAMPIRAN</w:t>
       </w:r>
     </w:p>
     <w:p>
       <w:pPr>
-        <w:keepNext/>
-        <w:spacing w:before="240" w:after="120" w:line="276" w:lineRule="auto"/>
-      </w:pPr>
-      <w:r>
-        <w:rPr>
-          <w:rFonts w:ascii="Times New Roman" w:hAnsi="Times New Roman"/>
-          <w:b/>
-          <w:color w:val="003366"/>
-          <w:sz w:val="28"/>
-        </w:rPr>
+        <w:pStyle w:val="Heading2"/>
+      </w:pPr>
+      <w:r>
         <w:t>LAMPIRAN A — RINGKASAN USE CASE KANONIK JUSTIFIQA</w:t>
       </w:r>
     </w:p>
@@ -11539,16 +11068,9 @@
     </w:p>
     <w:p>
       <w:pPr>
-        <w:keepNext/>
-        <w:spacing w:before="240" w:after="120" w:line="276" w:lineRule="auto"/>
-      </w:pPr>
-      <w:r>
-        <w:rPr>
-          <w:rFonts w:ascii="Times New Roman" w:hAnsi="Times New Roman"/>
-          <w:b/>
-          <w:color w:val="003366"/>
-          <w:sz w:val="28"/>
-        </w:rPr>
+        <w:pStyle w:val="Heading2"/>
+      </w:pPr>
+      <w:r>
         <w:t>LAMPIRAN B — TABEL MIGRASI DAN RPC UTAMA POSTGRESQL</w:t>
       </w:r>
     </w:p>
@@ -12084,16 +11606,9 @@
     </w:p>
     <w:p>
       <w:pPr>
-        <w:keepNext/>
-        <w:spacing w:before="240" w:after="120" w:line="276" w:lineRule="auto"/>
-      </w:pPr>
-      <w:r>
-        <w:rPr>
-          <w:rFonts w:ascii="Times New Roman" w:hAnsi="Times New Roman"/>
-          <w:b/>
-          <w:color w:val="003366"/>
-          <w:sz w:val="28"/>
-        </w:rPr>
+        <w:pStyle w:val="Heading2"/>
+      </w:pPr>
+      <w:r>
         <w:t>LAMPIRAN C — RINGKASAN BUKTI KOMIT GIT (COMMIT EVIDENCE SUMMARY)</w:t>
       </w:r>
     </w:p>
@@ -12715,16 +12230,9 @@
     </w:p>
     <w:p>
       <w:pPr>
-        <w:keepNext/>
-        <w:spacing w:before="240" w:after="120" w:line="276" w:lineRule="auto"/>
-      </w:pPr>
-      <w:r>
-        <w:rPr>
-          <w:rFonts w:ascii="Times New Roman" w:hAnsi="Times New Roman"/>
-          <w:b/>
-          <w:color w:val="003366"/>
-          <w:sz w:val="28"/>
-        </w:rPr>
+        <w:pStyle w:val="Heading2"/>
+      </w:pPr>
+      <w:r>
         <w:t>LAMPIRAN D — RINGKASAN HASIL PENGUJIAN (TEST RESULT SUMMARY)</w:t>
       </w:r>
     </w:p>
@@ -12823,16 +12331,9 @@
     </w:p>
     <w:p>
       <w:pPr>
-        <w:keepNext/>
-        <w:spacing w:before="240" w:after="120" w:line="276" w:lineRule="auto"/>
-      </w:pPr>
-      <w:r>
-        <w:rPr>
-          <w:rFonts w:ascii="Times New Roman" w:hAnsi="Times New Roman"/>
-          <w:b/>
-          <w:color w:val="003366"/>
-          <w:sz w:val="28"/>
-        </w:rPr>
+        <w:pStyle w:val="Heading2"/>
+      </w:pPr>
+      <w:r>
         <w:t>LAMPIRAN E — DEMO SCRIPT PRESENTASI JUJUR (DEMO SCRIPT)</w:t>
       </w:r>
     </w:p>
@@ -12993,16 +12494,9 @@
     </w:p>
     <w:p>
       <w:pPr>
-        <w:keepNext/>
-        <w:spacing w:before="240" w:after="120" w:line="276" w:lineRule="auto"/>
-      </w:pPr>
-      <w:r>
-        <w:rPr>
-          <w:rFonts w:ascii="Times New Roman" w:hAnsi="Times New Roman"/>
-          <w:b/>
-          <w:color w:val="003366"/>
-          <w:sz w:val="28"/>
-        </w:rPr>
+        <w:pStyle w:val="Heading2"/>
+      </w:pPr>
+      <w:r>
         <w:t>LAMPIRAN F — MATRIKS KETERBATASAN DAN SOURCE TRACEABILITY SUMMARY</w:t>
       </w:r>
     </w:p>
@@ -13030,6 +12524,7 @@
       </w:r>
     </w:p>
     <w:sectPr>
+      <w:footerReference w:type="default" r:id="rId9"/>
       <w:pgSz w:w="11909" w:h="16834"/>
       <w:pgMar w:top="1440" w:right="1440" w:bottom="1440" w:left="1440" w:header="720" w:footer="720" w:gutter="0"/>
       <w:cols w:space="720"/>
@@ -13037,6 +12532,28 @@
     </w:sectPr>
   </w:body>
 </w:document>
+</file>
+
+<file path=word/footer1.xml><?xml version="1.0" encoding="utf-8"?>
+<w:ftr xmlns:m="http://schemas.openxmlformats.org/officeDocument/2006/math" xmlns:mc="http://schemas.openxmlformats.org/markup-compatibility/2006" xmlns:mo="http://schemas.microsoft.com/office/mac/office/2008/main" xmlns:mv="urn:schemas-microsoft-com:mac:vml" xmlns:o="urn:schemas-microsoft-com:office:office" xmlns:r="http://schemas.openxmlformats.org/officeDocument/2006/relationships" xmlns:v="urn:schemas-microsoft-com:vml" xmlns:w10="urn:schemas-microsoft-com:office:word" xmlns:w14="http://schemas.microsoft.com/office/word/2010/wordml" xmlns:w="http://schemas.openxmlformats.org/wordprocessingml/2006/main" xmlns:wne="http://schemas.microsoft.com/office/word/2006/wordml" xmlns:wp14="http://schemas.microsoft.com/office/word/2010/wordprocessingDrawing" xmlns:wp="http://schemas.openxmlformats.org/drawingml/2006/wordprocessingDrawing" xmlns:wpc="http://schemas.microsoft.com/office/word/2010/wordprocessingCanvas" xmlns:wpg="http://schemas.microsoft.com/office/word/2010/wordprocessingGroup" xmlns:wpi="http://schemas.microsoft.com/office/word/2010/wordprocessingInk" xmlns:wps="http://schemas.microsoft.com/office/word/2010/wordprocessingShape" mc:Ignorable="w14 wp14">
+  <w:p>
+    <w:pPr>
+      <w:pStyle w:val="Footer"/>
+      <w:jc w:val="right"/>
+    </w:pPr>
+    <w:r>
+      <w:rPr>
+        <w:rFonts w:ascii="Times New Roman" w:hAnsi="Times New Roman"/>
+        <w:sz w:val="20"/>
+      </w:rPr>
+      <w:t xml:space="preserve">Halaman </w:t>
+    </w:r>
+    <w:fldChar w:fldCharType="begin"/>
+    <w:instrText xml:space="preserve"> PAGE </w:instrText>
+    <w:fldChar w:fldCharType="separate"/>
+    <w:fldChar w:fldCharType="end"/>
+  </w:p>
+</w:ftr>
 </file>
 
 <file path=word/numbering.xml><?xml version="1.0" encoding="utf-8"?>
@@ -13466,15 +12983,15 @@
     <w:pPr>
       <w:keepNext/>
       <w:keepLines/>
-      <w:spacing w:before="480" w:after="0"/>
+      <w:spacing w:before="280" w:after="120" w:line="276" w:lineRule="auto"/>
       <w:outlineLvl w:val="0"/>
     </w:pPr>
     <w:rPr>
-      <w:rFonts w:asciiTheme="majorHAnsi" w:eastAsiaTheme="majorEastAsia" w:hAnsiTheme="majorHAnsi" w:cstheme="majorBidi"/>
+      <w:rFonts w:asciiTheme="majorHAnsi" w:eastAsiaTheme="majorEastAsia" w:hAnsiTheme="majorHAnsi" w:cstheme="majorBidi" w:ascii="Times New Roman" w:hAnsi="Times New Roman"/>
       <w:b/>
       <w:bCs/>
-      <w:color w:val="365F91" w:themeColor="accent1" w:themeShade="BF"/>
-      <w:sz w:val="28"/>
+      <w:color w:val="003366"/>
+      <w:sz w:val="32"/>
       <w:szCs w:val="28"/>
     </w:rPr>
   </w:style>
@@ -13490,15 +13007,15 @@
     <w:pPr>
       <w:keepNext/>
       <w:keepLines/>
-      <w:spacing w:before="200" w:after="0"/>
+      <w:spacing w:before="240" w:after="120" w:line="276" w:lineRule="auto"/>
       <w:outlineLvl w:val="1"/>
     </w:pPr>
     <w:rPr>
-      <w:rFonts w:asciiTheme="majorHAnsi" w:eastAsiaTheme="majorEastAsia" w:hAnsiTheme="majorHAnsi" w:cstheme="majorBidi"/>
+      <w:rFonts w:asciiTheme="majorHAnsi" w:eastAsiaTheme="majorEastAsia" w:hAnsiTheme="majorHAnsi" w:cstheme="majorBidi" w:ascii="Times New Roman" w:hAnsi="Times New Roman"/>
       <w:b/>
       <w:bCs/>
-      <w:color w:val="4F81BD" w:themeColor="accent1"/>
-      <w:sz w:val="26"/>
+      <w:color w:val="003366"/>
+      <w:sz w:val="28"/>
       <w:szCs w:val="26"/>
     </w:rPr>
   </w:style>
@@ -13514,14 +13031,15 @@
     <w:pPr>
       <w:keepNext/>
       <w:keepLines/>
-      <w:spacing w:before="200" w:after="0"/>
+      <w:spacing w:before="200" w:after="80" w:line="276" w:lineRule="auto"/>
       <w:outlineLvl w:val="2"/>
     </w:pPr>
     <w:rPr>
-      <w:rFonts w:asciiTheme="majorHAnsi" w:eastAsiaTheme="majorEastAsia" w:hAnsiTheme="majorHAnsi" w:cstheme="majorBidi"/>
+      <w:rFonts w:asciiTheme="majorHAnsi" w:eastAsiaTheme="majorEastAsia" w:hAnsiTheme="majorHAnsi" w:cstheme="majorBidi" w:ascii="Times New Roman" w:hAnsi="Times New Roman"/>
       <w:b/>
       <w:bCs/>
-      <w:color w:val="4F81BD" w:themeColor="accent1"/>
+      <w:color w:val="333333"/>
+      <w:sz w:val="24"/>
     </w:rPr>
   </w:style>
   <w:style w:type="paragraph" w:styleId="Heading4">
@@ -13537,16 +13055,17 @@
     <w:pPr>
       <w:keepNext/>
       <w:keepLines/>
-      <w:spacing w:before="200" w:after="0"/>
+      <w:spacing w:before="160" w:after="80" w:line="276" w:lineRule="auto"/>
       <w:outlineLvl w:val="3"/>
     </w:pPr>
     <w:rPr>
-      <w:rFonts w:asciiTheme="majorHAnsi" w:eastAsiaTheme="majorEastAsia" w:hAnsiTheme="majorHAnsi" w:cstheme="majorBidi"/>
+      <w:rFonts w:asciiTheme="majorHAnsi" w:eastAsiaTheme="majorEastAsia" w:hAnsiTheme="majorHAnsi" w:cstheme="majorBidi" w:ascii="Times New Roman" w:hAnsi="Times New Roman"/>
       <w:b/>
       <w:bCs/>
       <w:i/>
       <w:iCs/>
-      <w:color w:val="4F81BD" w:themeColor="accent1"/>
+      <w:color w:val="333333"/>
+      <w:sz w:val="24"/>
     </w:rPr>
   </w:style>
   <w:style w:type="paragraph" w:styleId="Heading5">
@@ -13755,15 +13274,17 @@
       <w:pBdr>
         <w:bottom w:val="single" w:sz="8" w:space="4" w:color="4F81BD" w:themeColor="accent1"/>
       </w:pBdr>
-      <w:spacing w:after="300" w:line="240" w:lineRule="auto"/>
+      <w:spacing w:after="240" w:line="240" w:lineRule="auto" w:before="240"/>
       <w:contextualSpacing/>
+      <w:jc w:val="center"/>
     </w:pPr>
     <w:rPr>
-      <w:rFonts w:asciiTheme="majorHAnsi" w:eastAsiaTheme="majorEastAsia" w:hAnsiTheme="majorHAnsi" w:cstheme="majorBidi"/>
-      <w:color w:val="17365D" w:themeColor="text2" w:themeShade="BF"/>
+      <w:rFonts w:asciiTheme="majorHAnsi" w:eastAsiaTheme="majorEastAsia" w:hAnsiTheme="majorHAnsi" w:cstheme="majorBidi" w:ascii="Times New Roman" w:hAnsi="Times New Roman"/>
+      <w:b/>
+      <w:color w:val="003366"/>
       <w:spacing w:val="5"/>
       <w:kern w:val="28"/>
-      <w:sz w:val="52"/>
+      <w:sz w:val="36"/>
       <w:szCs w:val="52"/>
     </w:rPr>
   </w:style>

</xml_diff>